<commit_message>
updated weekly accomplishment report template
</commit_message>
<xml_diff>
--- a/public/files/ICS-WAR-TEMPLATE.docx
+++ b/public/files/ICS-WAR-TEMPLATE.docx
@@ -2,7 +2,129 @@
 <file path=word/document.xml><?xml version="1.0" encoding="utf-8"?>
 <w:document xmlns:wpc="http://schemas.microsoft.com/office/word/2010/wordprocessingCanvas" xmlns:mc="http://schemas.openxmlformats.org/markup-compatibility/2006" xmlns:o="urn:schemas-microsoft-com:office:office" xmlns:r="http://schemas.openxmlformats.org/officeDocument/2006/relationships" xmlns:m="http://schemas.openxmlformats.org/officeDocument/2006/math" xmlns:v="urn:schemas-microsoft-com:vml" xmlns:wp14="http://schemas.microsoft.com/office/word/2010/wordprocessingDrawing" xmlns:wp="http://schemas.openxmlformats.org/drawingml/2006/wordprocessingDrawing" xmlns:w10="urn:schemas-microsoft-com:office:word" xmlns:w="http://schemas.openxmlformats.org/wordprocessingml/2006/main" xmlns:w14="http://schemas.microsoft.com/office/word/2010/wordml" xmlns:wpg="http://schemas.microsoft.com/office/word/2010/wordprocessingGroup" xmlns:wpi="http://schemas.microsoft.com/office/word/2010/wordprocessingInk" xmlns:wne="http://schemas.microsoft.com/office/word/2006/wordml" xmlns:wps="http://schemas.microsoft.com/office/word/2010/wordprocessingShape" mc:Ignorable="w14 wp14">
   <w:body>
-    <w:p/>
+    <w:p>
+      <w:r>
+        <w:rPr>
+          <w:noProof/>
+          <w:lang w:eastAsia="en-GB"/>
+        </w:rPr>
+        <mc:AlternateContent>
+          <mc:Choice Requires="wpg">
+            <w:drawing>
+              <wp:anchor distT="0" distB="0" distL="0" distR="0" simplePos="0" relativeHeight="251659264" behindDoc="1" locked="0" layoutInCell="1" allowOverlap="1" wp14:anchorId="6C837AFC" wp14:editId="0B120F3C">
+                <wp:simplePos x="0" y="0"/>
+                <wp:positionH relativeFrom="page">
+                  <wp:posOffset>156845</wp:posOffset>
+                </wp:positionH>
+                <wp:positionV relativeFrom="page">
+                  <wp:posOffset>110490</wp:posOffset>
+                </wp:positionV>
+                <wp:extent cx="7339965" cy="9568815"/>
+                <wp:effectExtent l="0" t="0" r="0" b="0"/>
+                <wp:wrapNone/>
+                <wp:docPr id="1" name="Group 1"/>
+                <wp:cNvGraphicFramePr>
+                  <a:graphicFrameLocks xmlns:a="http://schemas.openxmlformats.org/drawingml/2006/main"/>
+                </wp:cNvGraphicFramePr>
+                <a:graphic xmlns:a="http://schemas.openxmlformats.org/drawingml/2006/main">
+                  <a:graphicData uri="http://schemas.microsoft.com/office/word/2010/wordprocessingGroup">
+                    <wpg:wgp>
+                      <wpg:cNvGrpSpPr>
+                        <a:grpSpLocks/>
+                      </wpg:cNvGrpSpPr>
+                      <wpg:grpSpPr>
+                        <a:xfrm>
+                          <a:off x="0" y="0"/>
+                          <a:ext cx="7339965" cy="9568815"/>
+                          <a:chOff x="0" y="0"/>
+                          <a:chExt cx="7339799" cy="9568508"/>
+                        </a:xfrm>
+                      </wpg:grpSpPr>
+                      <pic:pic xmlns:pic="http://schemas.openxmlformats.org/drawingml/2006/picture">
+                        <pic:nvPicPr>
+                          <pic:cNvPr id="2" name="Image 2"/>
+                          <pic:cNvPicPr/>
+                        </pic:nvPicPr>
+                        <pic:blipFill rotWithShape="1">
+                          <a:blip r:embed="rId5" cstate="print"/>
+                          <a:srcRect b="7930"/>
+                          <a:stretch/>
+                        </pic:blipFill>
+                        <pic:spPr>
+                          <a:xfrm>
+                            <a:off x="0" y="0"/>
+                            <a:ext cx="7339799" cy="9568508"/>
+                          </a:xfrm>
+                          <a:prstGeom prst="rect">
+                            <a:avLst/>
+                          </a:prstGeom>
+                        </pic:spPr>
+                      </pic:pic>
+                      <pic:pic xmlns:pic="http://schemas.openxmlformats.org/drawingml/2006/picture">
+                        <pic:nvPicPr>
+                          <pic:cNvPr id="3" name="Image 3"/>
+                          <pic:cNvPicPr/>
+                        </pic:nvPicPr>
+                        <pic:blipFill>
+                          <a:blip r:embed="rId6" cstate="print"/>
+                          <a:stretch>
+                            <a:fillRect/>
+                          </a:stretch>
+                        </pic:blipFill>
+                        <pic:spPr>
+                          <a:xfrm>
+                            <a:off x="5933331" y="51293"/>
+                            <a:ext cx="685800" cy="889634"/>
+                          </a:xfrm>
+                          <a:prstGeom prst="rect">
+                            <a:avLst/>
+                          </a:prstGeom>
+                        </pic:spPr>
+                      </pic:pic>
+                    </wpg:wgp>
+                  </a:graphicData>
+                </a:graphic>
+                <wp14:sizeRelV relativeFrom="margin">
+                  <wp14:pctHeight>0</wp14:pctHeight>
+                </wp14:sizeRelV>
+              </wp:anchor>
+            </w:drawing>
+          </mc:Choice>
+          <mc:Fallback>
+            <w:pict>
+              <v:group id="Group 1" o:spid="_x0000_s1026" style="position:absolute;margin-left:12.35pt;margin-top:8.7pt;width:577.95pt;height:753.45pt;z-index:-251657216;mso-wrap-distance-left:0;mso-wrap-distance-right:0;mso-position-horizontal-relative:page;mso-position-vertical-relative:page;mso-height-relative:margin" coordsize="73397,95685" o:gfxdata="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">
+                <v:shapetype id="_x0000_t75" coordsize="21600,21600" o:spt="75" o:preferrelative="t" path="m@4@5l@4@11@9@11@9@5xe" filled="f" stroked="f">
+                  <v:stroke joinstyle="miter"/>
+                  <v:formulas>
+                    <v:f eqn="if lineDrawn pixelLineWidth 0"/>
+                    <v:f eqn="sum @0 1 0"/>
+                    <v:f eqn="sum 0 0 @1"/>
+                    <v:f eqn="prod @2 1 2"/>
+                    <v:f eqn="prod @3 21600 pixelWidth"/>
+                    <v:f eqn="prod @3 21600 pixelHeight"/>
+                    <v:f eqn="sum @0 0 1"/>
+                    <v:f eqn="prod @6 1 2"/>
+                    <v:f eqn="prod @7 21600 pixelWidth"/>
+                    <v:f eqn="sum @8 21600 0"/>
+                    <v:f eqn="prod @7 21600 pixelHeight"/>
+                    <v:f eqn="sum @10 21600 0"/>
+                  </v:formulas>
+                  <v:path o:extrusionok="f" gradientshapeok="t" o:connecttype="rect"/>
+                  <o:lock v:ext="edit" aspectratio="t"/>
+                </v:shapetype>
+                <v:shape id="Image 2" o:spid="_x0000_s1027" type="#_x0000_t75" style="position:absolute;width:73397;height:95685;visibility:visible;mso-wrap-style:square" o:gfxdata="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">
+                  <v:imagedata r:id="rId7" o:title="" cropbottom="5197f"/>
+                </v:shape>
+                <v:shape id="Image 3" o:spid="_x0000_s1028" type="#_x0000_t75" style="position:absolute;left:59333;top:512;width:6858;height:8897;visibility:visible;mso-wrap-style:square" o:gfxdata="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">
+                  <v:imagedata r:id="rId8" o:title=""/>
+                </v:shape>
+                <w10:wrap anchorx="page" anchory="page"/>
+              </v:group>
+            </w:pict>
+          </mc:Fallback>
+        </mc:AlternateContent>
+      </w:r>
+    </w:p>
     <w:p/>
     <w:p>
       <w:pPr>
@@ -104,8 +226,6 @@
         </w:rPr>
         <w:t>AY 2026-2027</w:t>
       </w:r>
-      <w:bookmarkStart w:id="0" w:name="_GoBack"/>
-      <w:bookmarkEnd w:id="0"/>
     </w:p>
     <w:p>
       <w:pPr>
@@ -931,125 +1051,8 @@
     <w:p/>
     <w:p/>
     <w:p>
-      <w:r>
-        <w:rPr>
-          <w:noProof/>
-          <w:lang w:eastAsia="en-GB"/>
-        </w:rPr>
-        <mc:AlternateContent>
-          <mc:Choice Requires="wpg">
-            <w:drawing>
-              <wp:anchor distT="0" distB="0" distL="0" distR="0" simplePos="0" relativeHeight="251659264" behindDoc="1" locked="0" layoutInCell="1" allowOverlap="1" wp14:anchorId="05E52BEF" wp14:editId="43D31331">
-                <wp:simplePos x="0" y="0"/>
-                <wp:positionH relativeFrom="page">
-                  <wp:posOffset>156095</wp:posOffset>
-                </wp:positionH>
-                <wp:positionV relativeFrom="page">
-                  <wp:posOffset>114242</wp:posOffset>
-                </wp:positionV>
-                <wp:extent cx="7339965" cy="10393045"/>
-                <wp:effectExtent l="0" t="0" r="0" b="8255"/>
-                <wp:wrapNone/>
-                <wp:docPr id="1" name="Group 1"/>
-                <wp:cNvGraphicFramePr>
-                  <a:graphicFrameLocks xmlns:a="http://schemas.openxmlformats.org/drawingml/2006/main"/>
-                </wp:cNvGraphicFramePr>
-                <a:graphic xmlns:a="http://schemas.openxmlformats.org/drawingml/2006/main">
-                  <a:graphicData uri="http://schemas.microsoft.com/office/word/2010/wordprocessingGroup">
-                    <wpg:wgp>
-                      <wpg:cNvGrpSpPr>
-                        <a:grpSpLocks/>
-                      </wpg:cNvGrpSpPr>
-                      <wpg:grpSpPr>
-                        <a:xfrm>
-                          <a:off x="0" y="0"/>
-                          <a:ext cx="7339965" cy="10393045"/>
-                          <a:chOff x="0" y="0"/>
-                          <a:chExt cx="7339799" cy="10392649"/>
-                        </a:xfrm>
-                      </wpg:grpSpPr>
-                      <pic:pic xmlns:pic="http://schemas.openxmlformats.org/drawingml/2006/picture">
-                        <pic:nvPicPr>
-                          <pic:cNvPr id="2" name="Image 2"/>
-                          <pic:cNvPicPr/>
-                        </pic:nvPicPr>
-                        <pic:blipFill>
-                          <a:blip r:embed="rId5" cstate="print"/>
-                          <a:stretch>
-                            <a:fillRect/>
-                          </a:stretch>
-                        </pic:blipFill>
-                        <pic:spPr>
-                          <a:xfrm>
-                            <a:off x="0" y="0"/>
-                            <a:ext cx="7339799" cy="10392649"/>
-                          </a:xfrm>
-                          <a:prstGeom prst="rect">
-                            <a:avLst/>
-                          </a:prstGeom>
-                        </pic:spPr>
-                      </pic:pic>
-                      <pic:pic xmlns:pic="http://schemas.openxmlformats.org/drawingml/2006/picture">
-                        <pic:nvPicPr>
-                          <pic:cNvPr id="3" name="Image 3"/>
-                          <pic:cNvPicPr/>
-                        </pic:nvPicPr>
-                        <pic:blipFill>
-                          <a:blip r:embed="rId6" cstate="print"/>
-                          <a:stretch>
-                            <a:fillRect/>
-                          </a:stretch>
-                        </pic:blipFill>
-                        <pic:spPr>
-                          <a:xfrm>
-                            <a:off x="5933331" y="51293"/>
-                            <a:ext cx="685800" cy="889634"/>
-                          </a:xfrm>
-                          <a:prstGeom prst="rect">
-                            <a:avLst/>
-                          </a:prstGeom>
-                        </pic:spPr>
-                      </pic:pic>
-                    </wpg:wgp>
-                  </a:graphicData>
-                </a:graphic>
-              </wp:anchor>
-            </w:drawing>
-          </mc:Choice>
-          <mc:Fallback>
-            <w:pict>
-              <v:group id="Group 1" o:spid="_x0000_s1026" style="position:absolute;margin-left:12.3pt;margin-top:9pt;width:577.95pt;height:818.35pt;z-index:-251657216;mso-wrap-distance-left:0;mso-wrap-distance-right:0;mso-position-horizontal-relative:page;mso-position-vertical-relative:page" coordsize="73397,103926" o:gfxdata="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">
-                <v:shapetype id="_x0000_t75" coordsize="21600,21600" o:spt="75" o:preferrelative="t" path="m@4@5l@4@11@9@11@9@5xe" filled="f" stroked="f">
-                  <v:stroke joinstyle="miter"/>
-                  <v:formulas>
-                    <v:f eqn="if lineDrawn pixelLineWidth 0"/>
-                    <v:f eqn="sum @0 1 0"/>
-                    <v:f eqn="sum 0 0 @1"/>
-                    <v:f eqn="prod @2 1 2"/>
-                    <v:f eqn="prod @3 21600 pixelWidth"/>
-                    <v:f eqn="prod @3 21600 pixelHeight"/>
-                    <v:f eqn="sum @0 0 1"/>
-                    <v:f eqn="prod @6 1 2"/>
-                    <v:f eqn="prod @7 21600 pixelWidth"/>
-                    <v:f eqn="sum @8 21600 0"/>
-                    <v:f eqn="prod @7 21600 pixelHeight"/>
-                    <v:f eqn="sum @10 21600 0"/>
-                  </v:formulas>
-                  <v:path o:extrusionok="f" gradientshapeok="t" o:connecttype="rect"/>
-                  <o:lock v:ext="edit" aspectratio="t"/>
-                </v:shapetype>
-                <v:shape id="Image 2" o:spid="_x0000_s1027" type="#_x0000_t75" style="position:absolute;width:73397;height:103926;visibility:visible;mso-wrap-style:square" o:gfxdata="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">
-                  <v:imagedata r:id="rId7" o:title=""/>
-                </v:shape>
-                <v:shape id="Image 3" o:spid="_x0000_s1028" type="#_x0000_t75" style="position:absolute;left:59333;top:512;width:6858;height:8897;visibility:visible;mso-wrap-style:square" o:gfxdata="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">
-                  <v:imagedata r:id="rId8" o:title=""/>
-                </v:shape>
-                <w10:wrap anchorx="page" anchory="page"/>
-              </v:group>
-            </w:pict>
-          </mc:Fallback>
-        </mc:AlternateContent>
-      </w:r>
+      <w:bookmarkStart w:id="0" w:name="_GoBack"/>
+      <w:bookmarkEnd w:id="0"/>
     </w:p>
     <w:sectPr>
       <w:pgSz w:w="11906" w:h="16838"/>

</xml_diff>